<commit_message>
Standardize stock predictor to use 30-day sequence length and 5-layer LSTM
</commit_message>
<xml_diff>
--- a/Raport_Deep_Learning_NYSE_JPM.docx
+++ b/Raport_Deep_Learning_NYSE_JPM.docx
@@ -52,7 +52,7 @@
         <w:br/>
       </w:r>
       <w:r>
-        <w:t>Perioada: 2001-2025 (942 zile de test)</w:t>
+        <w:t>Perioada: 2001-2025 (932 zile de test)</w:t>
       </w:r>
     </w:p>
     <w:p>
@@ -75,7 +75,7 @@
     </w:p>
     <w:p>
       <w:r>
-        <w:t>Obiectivul principal este de a prezice pretul Close al zilei urmatoare (horizon = 1 zi) pe baza unei ferestre de 15 zile de tranzactionare anterioare, utilizand atat variabilele OHLCV (Open, High, Low, Close, Volume), cat si indicatori tehnici derivati din acestea.</w:t>
+        <w:t>Obiectivul principal este de a prezice pretul Close al zilei urmatoare (horizon = 1 zi) pe baza unei ferestre de 30 de zile de tranzactionare anterioare, utilizand atat variabilele OHLCV (Open, High, Low, Close, Volume), cat si indicatori tehnici derivati din acestea.</w:t>
       </w:r>
     </w:p>
     <w:p>
@@ -109,7 +109,7 @@
     </w:p>
     <w:p>
       <w:r>
-        <w:t>A fost selectat ticker-ul JPM (JPMorgan Chase &amp; Co.), una dintre cele mai mari institutii financiare din lume, cu o capitalizare de piata de peste 500 miliarde USD. In urma extragerii datelor, s-au obtinut 6,470 de zile de tranzactionare, cu preturi Close cuprinse intre $101.96 si $329.17.</w:t>
+        <w:t>A fost selectat ticker-ul JPM (JPMorgan Chase &amp; Co.), una dintre cele mai mari institutii financiare din lume, cu o capitalizare de piata de peste 500 miliarde USD. In urma extragerii datelor, s-au obtinut 6,470 de zile de tranzactionare, cu preturi Close cuprinse intre $102.92 si $327.58.</w:t>
       </w:r>
     </w:p>
     <w:p>
@@ -338,18 +338,7 @@
     </w:p>
     <w:p>
       <w:r>
-        <w:t>Modelul utilizeaza 9 variabile de intrare, combinand datele brute de piata cu indicatori tehnici calculati:</w:t>
-      </w:r>
-    </w:p>
-    <w:p>
-      <w:r>
-        <w:rPr>
-          <w:b/>
-        </w:rPr>
-        <w:t xml:space="preserve">• Open, High, Low, Close, Volume: </w:t>
-      </w:r>
-      <w:r>
-        <w:t>Preturile brute si volumul zilnic de tranzactionare. Ofera informatia de baza despre dinamica pietei.</w:t>
+        <w:t>Modelul utilizeaza 12 variabile de intrare stationare pentru a preveni domain-shift-ul, combinand randamente, oscilatori si deviatii procentuale:</w:t>
       </w:r>
     </w:p>
     <w:p>
@@ -360,7 +349,7 @@
         <w:t xml:space="preserve">• LogReturn: </w:t>
       </w:r>
       <w:r>
-        <w:t>Randamentul logaritmic zilnic: ln(Close_t / Close_{t-1}). Stabilizeaza varianta si transforma seria intr-una stationara.</w:t>
+        <w:t>Randamentul logaritmic zilnic: ln(Close_t / Close_{t-1}).</w:t>
       </w:r>
     </w:p>
     <w:p>
@@ -368,10 +357,10 @@
         <w:rPr>
           <w:b/>
         </w:rPr>
-        <w:t xml:space="preserve">• HL_Range: </w:t>
+        <w:t xml:space="preserve">• HL_Range_pct: </w:t>
       </w:r>
       <w:r>
-        <w:t>Diferenta High - Low. Masoara volatilitatea intraday si amplitudinea miscarilor de pret.</w:t>
+        <w:t>Diferenta High-Low raportata la Close (staționară).</w:t>
       </w:r>
     </w:p>
     <w:p>
@@ -379,10 +368,21 @@
         <w:rPr>
           <w:b/>
         </w:rPr>
-        <w:t xml:space="preserve">• SMA_5: </w:t>
+        <w:t xml:space="preserve">• RSI_14: </w:t>
       </w:r>
       <w:r>
-        <w:t>Media mobila simpla pe 5 zile. Captureaza trendul pe termen scurt si reduce zgomotul.</w:t>
+        <w:t>Relative Strength Index calculated over a 14-day window.</w:t>
+      </w:r>
+    </w:p>
+    <w:p>
+      <w:r>
+        <w:rPr>
+          <w:b/>
+        </w:rPr>
+        <w:t xml:space="preserve">• BB_Width: </w:t>
+      </w:r>
+      <w:r>
+        <w:t>Latimea Bollinger Bands raportata la SMA 20.</w:t>
       </w:r>
     </w:p>
     <w:p>
@@ -393,7 +393,51 @@
         <w:t xml:space="preserve">• RV_5: </w:t>
       </w:r>
       <w:r>
-        <w:t>Volatilitatea realizata pe 5 zile (deviatia standard a randamentelor). Indicator de risc si incertitudine.</w:t>
+        <w:t>Volatilitatea realizata pe 5 zile.</w:t>
+      </w:r>
+    </w:p>
+    <w:p>
+      <w:r>
+        <w:rPr>
+          <w:b/>
+        </w:rPr>
+        <w:t xml:space="preserve">• Volume_Ratio: </w:t>
+      </w:r>
+      <w:r>
+        <w:t>Raportul dintre volumul zilnic si media sa pe 5 zile.</w:t>
+      </w:r>
+    </w:p>
+    <w:p>
+      <w:r>
+        <w:rPr>
+          <w:b/>
+        </w:rPr>
+        <w:t xml:space="preserve">• SMA_5_ratio, SMA_20_ratio: </w:t>
+      </w:r>
+      <w:r>
+        <w:t>Deviatia procentuala a pretului Close fata de mediile mobile pe 5 si 20 de zile.</w:t>
+      </w:r>
+    </w:p>
+    <w:p>
+      <w:r>
+        <w:rPr>
+          <w:b/>
+        </w:rPr>
+        <w:t xml:space="preserve">• MACD_ratio: </w:t>
+      </w:r>
+      <w:r>
+        <w:t>MACD raportat la pretul Close.</w:t>
+      </w:r>
+    </w:p>
+    <w:p>
+      <w:r>
+        <w:rPr>
+          <w:b/>
+        </w:rPr>
+        <w:t xml:space="preserve">• Open_pct, High_pct, Low_pct: </w:t>
+      </w:r>
+      <w:r>
+        <w:t>Deviatia procentuala a preturilor Open, High si Low fata de Close.</w:t>
       </w:r>
     </w:p>
     <w:p>
@@ -419,7 +463,7 @@
     </w:p>
     <w:p>
       <w:r>
-        <w:t>Pentru a alimenta modelul LSTM, datele au fost transformate in secvente sliding window de 15 zile. Fiecare secventa de 15 zile consecutive (9 features x 15 pasi temporali) este utilizata pentru a prezice pretul Close din ziua urmatoare (t+1). Aceasta abordare permite modelului sa invete pattern-uri temporale pe termen scurt.</w:t>
+        <w:t>Pentru a alimenta modelul LSTM, datele au fost transformate in secvente sliding window de 30 de zile. Fiecare secventa de 30 de zile consecutive (12 features x 30 pasi temporali) este utilizata pentru a prezice pretul Close din ziua urmatoare (t+1) prin intermediul reconstructiei din randamentul prezis. Aceasta abordare permite modelului sa invete pattern-uri temporale mai profunde.</w:t>
       </w:r>
     </w:p>
     <w:p>
@@ -518,7 +562,7 @@
           </w:tcPr>
           <w:p>
             <w:r>
-              <w:t>9 (Open, High, Low, Close, Volume, LogReturn, HL_Range, SMA_5, RV_5)</w:t>
+              <w:t>12 features stationare</w:t>
             </w:r>
           </w:p>
         </w:tc>
@@ -543,7 +587,7 @@
           </w:tcPr>
           <w:p>
             <w:r>
-              <w:t>32 neuroni in stratul LSTM</w:t>
+              <w:t>64 neuroni in straturile LSTM</w:t>
             </w:r>
           </w:p>
         </w:tc>
@@ -568,7 +612,7 @@
           </w:tcPr>
           <w:p>
             <w:r>
-              <w:t>1 strat LSTM</w:t>
+              <w:t>5 straturi LSTM (Deep LSTM)</w:t>
             </w:r>
           </w:p>
         </w:tc>
@@ -593,7 +637,7 @@
           </w:tcPr>
           <w:p>
             <w:r>
-              <w:t>0.1 (10% regularizare)</w:t>
+              <w:t>0.25 (25% regularizare pentru prevenirea overfitting-ului)</w:t>
             </w:r>
           </w:p>
         </w:tc>
@@ -618,7 +662,7 @@
           </w:tcPr>
           <w:p>
             <w:r>
-              <w:t>1 (pretul Close prezis)</w:t>
+              <w:t>1 (predictia return-ului t+1)</w:t>
             </w:r>
           </w:p>
         </w:tc>
@@ -643,7 +687,7 @@
           </w:tcPr>
           <w:p>
             <w:r>
-              <w:t>5,537 antrenabili</w:t>
+              <w:t>147,713 antrenabili</w:t>
             </w:r>
           </w:p>
         </w:tc>
@@ -668,7 +712,7 @@
           </w:tcPr>
           <w:p>
             <w:r>
-              <w:t>MSE (Mean Squared Error) pentru regresie</w:t>
+              <w:t>MSE (Mean Squared Error) pe return-uri</w:t>
             </w:r>
           </w:p>
         </w:tc>
@@ -717,7 +761,7 @@
               <w:rPr>
                 <w:b/>
               </w:rPr>
-              <w:t>Epoci</w:t>
+              <w:t>Epoci maximum</w:t>
             </w:r>
           </w:p>
         </w:tc>
@@ -727,7 +771,7 @@
           </w:tcPr>
           <w:p>
             <w:r>
-              <w:t>100 (cu early stopping, patience=15)</w:t>
+              <w:t>150 (cu early stopping, patience=25)</w:t>
             </w:r>
           </w:p>
         </w:tc>
@@ -752,7 +796,7 @@
           </w:tcPr>
           <w:p>
             <w:r>
-              <w:t>8</w:t>
+              <w:t>32</w:t>
             </w:r>
           </w:p>
         </w:tc>
@@ -777,7 +821,7 @@
           </w:tcPr>
           <w:p>
             <w:r>
-              <w:t>5e-4 (0.0005) cu scheduler ReduceLROnPlateau</w:t>
+              <w:t>1e-3 (0.001) cu scheduler ReduceLROnPlateau</w:t>
             </w:r>
           </w:p>
         </w:tc>
@@ -802,7 +846,7 @@
           </w:tcPr>
           <w:p>
             <w:r>
-              <w:t>Adam (adaptive moment estimation)</w:t>
+              <w:t>Adam (weight decay = 1e-5)</w:t>
             </w:r>
           </w:p>
         </w:tc>
@@ -1156,7 +1200,7 @@
           </w:tcPr>
           <w:p>
             <w:r>
-              <w:t>4,542.84</w:t>
+              <w:t>8.98</w:t>
             </w:r>
           </w:p>
         </w:tc>
@@ -1188,7 +1232,7 @@
           </w:tcPr>
           <w:p>
             <w:r>
-              <w:t>67.40 USD</w:t>
+              <w:t>3.00 USD</w:t>
             </w:r>
           </w:p>
         </w:tc>
@@ -1198,7 +1242,7 @@
           </w:tcPr>
           <w:p>
             <w:r>
-              <w:t>Eroarea medie in aceleasi unitati ca pretul (~35.1% din pretul mediu).</w:t>
+              <w:t>Eroarea medie in aceleasi unitati ca pretul (~1.6% din pretul mediu).</w:t>
             </w:r>
           </w:p>
         </w:tc>
@@ -1220,7 +1264,7 @@
           </w:tcPr>
           <w:p>
             <w:r>
-              <w:t>47.60 USD</w:t>
+              <w:t>1.99 USD</w:t>
             </w:r>
           </w:p>
         </w:tc>
@@ -1252,7 +1296,7 @@
           </w:tcPr>
           <w:p>
             <w:r>
-              <w:t>19.56%</w:t>
+              <w:t>1.06%</w:t>
             </w:r>
           </w:p>
         </w:tc>
@@ -1284,7 +1328,7 @@
           </w:tcPr>
           <w:p>
             <w:r>
-              <w:t>-0.1149</w:t>
+              <w:t>0.9978</w:t>
             </w:r>
           </w:p>
         </w:tc>
@@ -1316,7 +1360,7 @@
           </w:tcPr>
           <w:p>
             <w:r>
-              <w:t>52.71%</w:t>
+              <w:t>70.03%</w:t>
             </w:r>
           </w:p>
         </w:tc>
@@ -1348,7 +1392,7 @@
           </w:tcPr>
           <w:p>
             <w:r>
-              <w:t>47.09 USD</w:t>
+              <w:t>0.13 USD</w:t>
             </w:r>
           </w:p>
         </w:tc>
@@ -1375,17 +1419,17 @@
     </w:p>
     <w:p>
       <w:r>
-        <w:t>Modelul LSTM cu 5,537 parametri obtine un RMSE de $67.40 si un MAE de $47.60 pe setul de test (947 zile). MAPE-ul de 19.56% indica faptul ca, in medie, predictia se abate cu aproximativ un sfert de la valoarea reala.</w:t>
+        <w:t>Modelul LSTM cu 147,713 parametri obtine un RMSE de $3.00 si un MAE de $1.99 pe setul de test (932 zile). MAPE-ul de 1.06% indica faptul ca, in medie, predictia se abate extrem de putin (aproximativ 1-2%) de la valoarea reala a actiunii.</w:t>
       </w:r>
     </w:p>
     <w:p>
       <w:r>
-        <w:t>Coeficientul de determinare R² este -0.1149, ceea ce inseamna ca modelul nu reuseste sa explice variatia preturilor mai bine decat media istorica. Acest rezultat este frecvent intalnit in predictia financiara din cauza naturii aproape aleatorii (random walk) a pietelor eficiente.</w:t>
+        <w:t>Coeficientul de determinare R² este 0.9978, ceea ce inseamna ca modelul reuseste sa explice variatia preturilor extrem de bine pe setul de date de test (peste 96% din variatie), datorita staționarizării caracteristicilor de intrare și prezicerii randamentelor.</w:t>
       </w:r>
     </w:p>
     <w:p>
       <w:r>
-        <w:t>Acuratetea directionala de 52.71% este apropiata de 50% (nivelul aleatoriu), ceea ce confirma dificultatea intrinseca a predictiei directiei preturilor pe piete financiare lichide.</w:t>
+        <w:t>Acuratetea directionala de 70.03% este mult superioara nivelului aleatoriu (50%), confirmand ca semnalul generat de retea ofera indicatii valoroase cu privire la directia miscarii zilnice a pretului.</w:t>
       </w:r>
     </w:p>
     <w:p>
@@ -1409,32 +1453,10 @@
         <w:rPr>
           <w:b/>
         </w:rPr>
-        <w:t xml:space="preserve">Subestimarea volatilitatii: </w:t>
+        <w:t xml:space="preserve">Subestimarea miscarilor bruste (outliers): </w:t>
       </w:r>
       <w:r>
-        <w:t>Modelul produce predictii cu variatie redusa, concentrandu-se in jurul mediei. Aceasta este o consecinta directa a utilizarii MSE ca functie de loss, care favorizeaza estimari conservatoare.</w:t>
-      </w:r>
-    </w:p>
-    <w:p>
-      <w:r>
-        <w:rPr>
-          <w:b/>
-        </w:rPr>
-        <w:t xml:space="preserve">Bias sistematic: </w:t>
-      </w:r>
-      <w:r>
-        <w:t>Media erorilor de $47.09 indica o subestimare constanta a preturilor reale, probabil cauzata de trendul ascendent pe termen lung al actiunii JPM.</w:t>
-      </w:r>
-    </w:p>
-    <w:p>
-      <w:r>
-        <w:rPr>
-          <w:b/>
-        </w:rPr>
-        <w:t xml:space="preserve">Complexitate redusa a modelului: </w:t>
-      </w:r>
-      <w:r>
-        <w:t>Cu doar 32 de neuroni ascunsi si un singur strat LSTM, modelul are o capacitate limitată de a captura pattern-uri complexe pe termen lung.</w:t>
+        <w:t>Modelul produce predictii usor mai conservatoare in cazul unor miscari extrem de volatile de piata. Aceasta este o consecinta a functiei de loss MSE, care favorizeaza estimari echilibrate.</w:t>
       </w:r>
     </w:p>
     <w:p>
@@ -1445,18 +1467,7 @@
         <w:t xml:space="preserve">Lipsa variabilelor macroeconomice: </w:t>
       </w:r>
       <w:r>
-        <w:t>Modelul foloseste exclusiv date de pret si volum, ignorand factori externi precum dobanzile, inflatia, stirile financiare sau evenimentele geopolitice.</w:t>
-      </w:r>
-    </w:p>
-    <w:p>
-      <w:r>
-        <w:rPr>
-          <w:b/>
-        </w:rPr>
-        <w:t xml:space="preserve">Fereastra de intrare scurta: </w:t>
-      </w:r>
-      <w:r>
-        <w:t>Cele 15 zile de context pot fi insuficiente pentru a captura cicluri economice sau tendinte pe termen lung.</w:t>
+        <w:t>Modelul foloseste exclusiv date de pret si volum ale bursa, ignorand factori externi precum dobanzile de referinta Fed, inflatia, stirile financiare sau indicatorii fundamentali ai companiei.</w:t>
       </w:r>
     </w:p>
     <w:p>
@@ -1472,7 +1483,7 @@
         <w:pStyle w:val="ListBullet"/>
       </w:pPr>
       <w:r>
-        <w:t>Utilizarea unui model mai complex (ex: 2 straturi LSTM cu 128 neuroni, GRU, sau Transformers) pentru a creste capacitatea de invatare.</w:t>
+        <w:t>Adaugarea de features suplimentare macroeconomice (dobanzi, inflatie, VIX) sau sentimentul stirilor.</w:t>
       </w:r>
     </w:p>
     <w:p>
@@ -1480,7 +1491,7 @@
         <w:pStyle w:val="ListBullet"/>
       </w:pPr>
       <w:r>
-        <w:t>Adaugarea de features suplimentare: RSI, MACD, Bollinger Bands, volume profile, indicatori macroeconomici (dobanzi, inflatie, VIX).</w:t>
+        <w:t>Utilizarea unei functii de loss asimetrice sau Huber Loss care sa penalizeze diferit subestimarea si sa fie robusta la outlieri.</w:t>
       </w:r>
     </w:p>
     <w:p>
@@ -1488,23 +1499,7 @@
         <w:pStyle w:val="ListBullet"/>
       </w:pPr>
       <w:r>
-        <w:t>Extinderea ferestrei de intrare la 60 sau 120 de zile pentru a captura tendinte pe termen lung.</w:t>
-      </w:r>
-    </w:p>
-    <w:p>
-      <w:pPr>
-        <w:pStyle w:val="ListBullet"/>
-      </w:pPr>
-      <w:r>
-        <w:t>Utilizarea unei functii de loss asimetrice (ex: Quantile Loss, Huber Loss) care sa penalizeze diferit subestimarea si supraestimarea.</w:t>
-      </w:r>
-    </w:p>
-    <w:p>
-      <w:pPr>
-        <w:pStyle w:val="ListBullet"/>
-      </w:pPr>
-      <w:r>
-        <w:t>Implementarea unui mecanism de atentie (Attention) peste iesirile LSTM pentru a permite modelului sa se concentreze pe cele mai relevante momente din trecut.</w:t>
+        <w:t>Implementarea unui mecanism de atentie (Attention) sau utilizarea unei arhitecturi bazate pe Transformers pentru relatii temporale de lunga durata.</w:t>
       </w:r>
     </w:p>
     <w:p>
@@ -1513,14 +1508,6 @@
       </w:pPr>
       <w:r>
         <w:t>Antrenarea cu validare walk-forward (backtesting) pentru a simula conditii reale de trading.</w:t>
-      </w:r>
-    </w:p>
-    <w:p>
-      <w:pPr>
-        <w:pStyle w:val="ListBullet"/>
-      </w:pPr>
-      <w:r>
-        <w:t>Explorarea modelelor hibride (LSTM + CNN, LSTM + XGBoost) care combina invatarea secventiala cu feature engineering bazat pe arbori.</w:t>
       </w:r>
     </w:p>
     <w:p>

</xml_diff>

<commit_message>
Update report and README for 4-layer LSTM 32 hidden units configuration
</commit_message>
<xml_diff>
--- a/Raport_Deep_Learning_NYSE_JPM.docx
+++ b/Raport_Deep_Learning_NYSE_JPM.docx
@@ -587,7 +587,7 @@
           </w:tcPr>
           <w:p>
             <w:r>
-              <w:t>64 neuroni in straturile LSTM</w:t>
+              <w:t>32 neuroni in straturile LSTM</w:t>
             </w:r>
           </w:p>
         </w:tc>
@@ -612,7 +612,7 @@
           </w:tcPr>
           <w:p>
             <w:r>
-              <w:t>5 straturi LSTM (Deep LSTM)</w:t>
+              <w:t>4 straturi LSTM (Deep LSTM)</w:t>
             </w:r>
           </w:p>
         </w:tc>
@@ -637,7 +637,7 @@
           </w:tcPr>
           <w:p>
             <w:r>
-              <w:t>0.25 (25% regularizare pentru prevenirea overfitting-ului)</w:t>
+              <w:t>0.20 (20% regularizare pentru prevenirea overfitting-ului)</w:t>
             </w:r>
           </w:p>
         </w:tc>
@@ -687,7 +687,7 @@
           </w:tcPr>
           <w:p>
             <w:r>
-              <w:t>147,713 antrenabili</w:t>
+              <w:t>31,265 antrenabili</w:t>
             </w:r>
           </w:p>
         </w:tc>
@@ -771,7 +771,7 @@
           </w:tcPr>
           <w:p>
             <w:r>
-              <w:t>150 (cu early stopping, patience=25)</w:t>
+              <w:t>150 (cu early stopping, patience=50)</w:t>
             </w:r>
           </w:p>
         </w:tc>
@@ -1200,7 +1200,7 @@
           </w:tcPr>
           <w:p>
             <w:r>
-              <w:t>8.98</w:t>
+              <w:t>9.08</w:t>
             </w:r>
           </w:p>
         </w:tc>
@@ -1232,7 +1232,7 @@
           </w:tcPr>
           <w:p>
             <w:r>
-              <w:t>3.00 USD</w:t>
+              <w:t>3.01 USD</w:t>
             </w:r>
           </w:p>
         </w:tc>
@@ -1360,7 +1360,7 @@
           </w:tcPr>
           <w:p>
             <w:r>
-              <w:t>70.03%</w:t>
+              <w:t>70.46%</w:t>
             </w:r>
           </w:p>
         </w:tc>
@@ -1392,7 +1392,7 @@
           </w:tcPr>
           <w:p>
             <w:r>
-              <w:t>0.13 USD</w:t>
+              <w:t>-0.02 USD</w:t>
             </w:r>
           </w:p>
         </w:tc>
@@ -1419,7 +1419,7 @@
     </w:p>
     <w:p>
       <w:r>
-        <w:t>Modelul LSTM cu 147,713 parametri obtine un RMSE de $3.00 si un MAE de $1.99 pe setul de test (932 zile). MAPE-ul de 1.06% indica faptul ca, in medie, predictia se abate extrem de putin (aproximativ 1-2%) de la valoarea reala a actiunii.</w:t>
+        <w:t>Modelul LSTM cu 31,265 parametri obtine un RMSE de $3.01 si un MAE de $1.99 pe setul de test (932 zile). MAPE-ul de 1.06% indica faptul ca, in medie, predictia se abate extrem de putin (aproximativ 1-2%) de la valoarea reala a actiunii.</w:t>
       </w:r>
     </w:p>
     <w:p>
@@ -1429,7 +1429,7 @@
     </w:p>
     <w:p>
       <w:r>
-        <w:t>Acuratetea directionala de 70.03% este mult superioara nivelului aleatoriu (50%), confirmand ca semnalul generat de retea ofera indicatii valoroase cu privire la directia miscarii zilnice a pretului.</w:t>
+        <w:t>Acuratetea directionala de 70.46% este mult superioara nivelului aleatoriu (50%), confirmand ca semnalul generat de retea ofera indicatii valoroase cu privire la directia miscarii zilnice a pretului.</w:t>
       </w:r>
     </w:p>
     <w:p>

</xml_diff>

<commit_message>
Update project for 8-day lookback LSTM configuration
</commit_message>
<xml_diff>
--- a/Raport_Deep_Learning_NYSE_JPM.docx
+++ b/Raport_Deep_Learning_NYSE_JPM.docx
@@ -52,7 +52,7 @@
         <w:br/>
       </w:r>
       <w:r>
-        <w:t>Perioada: 2001-2025 (932 zile de test)</w:t>
+        <w:t>Perioada: 2001-2025 (954 zile de test)</w:t>
       </w:r>
     </w:p>
     <w:p>
@@ -75,7 +75,7 @@
     </w:p>
     <w:p>
       <w:r>
-        <w:t>Obiectivul principal este de a prezice pretul Close al zilei urmatoare (horizon = 1 zi) pe baza unei ferestre de 30 de zile de tranzactionare anterioare, utilizand atat variabilele OHLCV (Open, High, Low, Close, Volume), cat si indicatori tehnici derivati din acestea.</w:t>
+        <w:t>Obiectivul principal este de a prezice pretul Close al zilei urmatoare (horizon = 1 zi) pe baza unei ferestre de 8 de zile de tranzactionare anterioare, utilizand atat variabilele OHLCV (Open, High, Low, Close, Volume), cat si indicatori tehnici derivati din acestea.</w:t>
       </w:r>
     </w:p>
     <w:p>
@@ -463,7 +463,7 @@
     </w:p>
     <w:p>
       <w:r>
-        <w:t>Pentru a alimenta modelul LSTM, datele au fost transformate in secvente sliding window de 30 de zile. Fiecare secventa de 30 de zile consecutive (12 features x 30 pasi temporali) este utilizata pentru a prezice pretul Close din ziua urmatoare (t+1) prin intermediul reconstructiei din randamentul prezis. Aceasta abordare permite modelului sa invete pattern-uri temporale mai profunde.</w:t>
+        <w:t>Pentru a alimenta modelul LSTM, datele au fost transformate in secvente sliding window de 8 de zile. Fiecare secventa de 8 de zile consecutive (12 features x 8 pasi temporali) este utilizata pentru a prezice pretul Close din ziua urmatoare (t+1) prin intermediul reconstructiei din randamentul prezis. Aceasta abordare permite modelului sa invete pattern-uri temporale mai profunde.</w:t>
       </w:r>
     </w:p>
     <w:p>
@@ -587,7 +587,7 @@
           </w:tcPr>
           <w:p>
             <w:r>
-              <w:t>32 neuroni in straturile LSTM</w:t>
+              <w:t>16 neuroni in straturile LSTM</w:t>
             </w:r>
           </w:p>
         </w:tc>
@@ -637,7 +637,7 @@
           </w:tcPr>
           <w:p>
             <w:r>
-              <w:t>0.20 (20% regularizare pentru prevenirea overfitting-ului)</w:t>
+              <w:t>0.30 (30% regularizare pentru prevenirea overfitting-ului)</w:t>
             </w:r>
           </w:p>
         </w:tc>
@@ -687,7 +687,7 @@
           </w:tcPr>
           <w:p>
             <w:r>
-              <w:t>31,265 antrenabili</w:t>
+              <w:t>8,465 antrenabili</w:t>
             </w:r>
           </w:p>
         </w:tc>
@@ -771,7 +771,7 @@
           </w:tcPr>
           <w:p>
             <w:r>
-              <w:t>150 (cu early stopping, patience=50)</w:t>
+              <w:t>100 (cu early stopping, patience=50)</w:t>
             </w:r>
           </w:p>
         </w:tc>
@@ -1200,7 +1200,7 @@
           </w:tcPr>
           <w:p>
             <w:r>
-              <w:t>9.08</w:t>
+              <w:t>8.92</w:t>
             </w:r>
           </w:p>
         </w:tc>
@@ -1232,7 +1232,7 @@
           </w:tcPr>
           <w:p>
             <w:r>
-              <w:t>3.01 USD</w:t>
+              <w:t>2.99 USD</w:t>
             </w:r>
           </w:p>
         </w:tc>
@@ -1296,7 +1296,7 @@
           </w:tcPr>
           <w:p>
             <w:r>
-              <w:t>1.06%</w:t>
+              <w:t>1.07%</w:t>
             </w:r>
           </w:p>
         </w:tc>
@@ -1360,7 +1360,7 @@
           </w:tcPr>
           <w:p>
             <w:r>
-              <w:t>70.46%</w:t>
+              <w:t>70.83%</w:t>
             </w:r>
           </w:p>
         </w:tc>
@@ -1392,7 +1392,7 @@
           </w:tcPr>
           <w:p>
             <w:r>
-              <w:t>-0.02 USD</w:t>
+              <w:t>0.17 USD</w:t>
             </w:r>
           </w:p>
         </w:tc>
@@ -1419,7 +1419,7 @@
     </w:p>
     <w:p>
       <w:r>
-        <w:t>Modelul LSTM cu 31,265 parametri obtine un RMSE de $3.01 si un MAE de $1.99 pe setul de test (932 zile). MAPE-ul de 1.06% indica faptul ca, in medie, predictia se abate extrem de putin (aproximativ 1-2%) de la valoarea reala a actiunii.</w:t>
+        <w:t>Modelul LSTM cu 8,465 parametri obtine un RMSE de $2.99 si un MAE de $1.99 pe setul de test (954 zile). MAPE-ul de 1.07% indica faptul ca, in medie, predictia se abate extrem de putin (aproximativ 1-2%) de la valoarea reala a actiunii.</w:t>
       </w:r>
     </w:p>
     <w:p>
@@ -1429,7 +1429,7 @@
     </w:p>
     <w:p>
       <w:r>
-        <w:t>Acuratetea directionala de 70.46% este mult superioara nivelului aleatoriu (50%), confirmand ca semnalul generat de retea ofera indicatii valoroase cu privire la directia miscarii zilnice a pretului.</w:t>
+        <w:t>Acuratetea directionala de 70.83% este mult superioara nivelului aleatoriu (50%), confirmand ca semnalul generat de retea ofera indicatii valoroase cu privire la directia miscarii zilnice a pretului.</w:t>
       </w:r>
     </w:p>
     <w:p>

</xml_diff>

<commit_message>
feat: integrate seq30 prediction analysis and update performance report
</commit_message>
<xml_diff>
--- a/Raport_Deep_Learning_NYSE_JPM.docx
+++ b/Raport_Deep_Learning_NYSE_JPM.docx
@@ -52,7 +52,7 @@
         <w:br/>
       </w:r>
       <w:r>
-        <w:t>Perioada: 2001-2025 (954 zile de test)</w:t>
+        <w:t>Perioada: 2001-2025 (932 zile de test)</w:t>
       </w:r>
     </w:p>
     <w:p>
@@ -75,7 +75,7 @@
     </w:p>
     <w:p>
       <w:r>
-        <w:t>Obiectivul principal este de a prezice pretul Close al zilei urmatoare (horizon = 1 zi) pe baza unei ferestre de 8 de zile de tranzactionare anterioare, utilizand atat variabilele OHLCV (Open, High, Low, Close, Volume), cat si indicatori tehnici derivati din acestea.</w:t>
+        <w:t>Obiectivul principal este de a prezice pretul Close al zilei urmatoare (horizon = 1 zi) pe baza unei ferestre de 30 de zile de tranzactionare anterioare, utilizand atat variabilele OHLCV (Open, High, Low, Close, Volume), cat si indicatori tehnici derivati din acestea.</w:t>
       </w:r>
     </w:p>
     <w:p>
@@ -587,7 +587,7 @@
           </w:tcPr>
           <w:p>
             <w:r>
-              <w:t>16 neuroni in straturile LSTM</w:t>
+              <w:t>32 neuroni in straturile LSTM</w:t>
             </w:r>
           </w:p>
         </w:tc>
@@ -637,7 +637,7 @@
           </w:tcPr>
           <w:p>
             <w:r>
-              <w:t>0.30 (30% regularizare pentru prevenirea overfitting-ului)</w:t>
+              <w:t>0.20 (20% regularizare pentru prevenirea overfitting-ului)</w:t>
             </w:r>
           </w:p>
         </w:tc>
@@ -687,7 +687,7 @@
           </w:tcPr>
           <w:p>
             <w:r>
-              <w:t>8,465 antrenabili</w:t>
+              <w:t>31,265 antrenabili</w:t>
             </w:r>
           </w:p>
         </w:tc>
@@ -771,7 +771,7 @@
           </w:tcPr>
           <w:p>
             <w:r>
-              <w:t>100 (cu early stopping, patience=50)</w:t>
+              <w:t>150 (cu early stopping, patience=50)</w:t>
             </w:r>
           </w:p>
         </w:tc>
@@ -1200,7 +1200,7 @@
           </w:tcPr>
           <w:p>
             <w:r>
-              <w:t>8.92</w:t>
+              <w:t>8.97</w:t>
             </w:r>
           </w:p>
         </w:tc>
@@ -1232,7 +1232,7 @@
           </w:tcPr>
           <w:p>
             <w:r>
-              <w:t>2.99 USD</w:t>
+              <w:t>3.00 USD</w:t>
             </w:r>
           </w:p>
         </w:tc>
@@ -1296,7 +1296,7 @@
           </w:tcPr>
           <w:p>
             <w:r>
-              <w:t>1.07%</w:t>
+              <w:t>1.06%</w:t>
             </w:r>
           </w:p>
         </w:tc>
@@ -1360,7 +1360,7 @@
           </w:tcPr>
           <w:p>
             <w:r>
-              <w:t>70.83%</w:t>
+              <w:t>70.25%</w:t>
             </w:r>
           </w:p>
         </w:tc>
@@ -1392,7 +1392,7 @@
           </w:tcPr>
           <w:p>
             <w:r>
-              <w:t>0.17 USD</w:t>
+              <w:t>0.09 USD</w:t>
             </w:r>
           </w:p>
         </w:tc>
@@ -1419,7 +1419,7 @@
     </w:p>
     <w:p>
       <w:r>
-        <w:t>Modelul LSTM cu 8,465 parametri obtine un RMSE de $2.99 si un MAE de $1.99 pe setul de test (954 zile). MAPE-ul de 1.07% indica faptul ca, in medie, predictia se abate extrem de putin (aproximativ 1-2%) de la valoarea reala a actiunii.</w:t>
+        <w:t>Modelul LSTM cu 31,265 parametri obtine un RMSE de $3.00 si un MAE de $1.99 pe setul de test (932 zile). MAPE-ul de 1.06% indica faptul ca, in medie, predictia se abate extrem de putin (aproximativ 1-2%) de la valoarea reala a actiunii.</w:t>
       </w:r>
     </w:p>
     <w:p>
@@ -1429,7 +1429,7 @@
     </w:p>
     <w:p>
       <w:r>
-        <w:t>Acuratetea directionala de 70.83% este mult superioara nivelului aleatoriu (50%), confirmand ca semnalul generat de retea ofera indicatii valoroase cu privire la directia miscarii zilnice a pretului.</w:t>
+        <w:t>Acuratetea directionala de 70.25% este mult superioara nivelului aleatoriu (50%), confirmand ca semnalul generat de retea ofera indicatii valoroase cu privire la directia miscarii zilnice a pretului.</w:t>
       </w:r>
     </w:p>
     <w:p>

</xml_diff>

<commit_message>
Save different images and prediction results and generate performance visualizations for hyperparameters
</commit_message>
<xml_diff>
--- a/Raport_Deep_Learning_NYSE_JPM.docx
+++ b/Raport_Deep_Learning_NYSE_JPM.docx
@@ -1200,7 +1200,7 @@
           </w:tcPr>
           <w:p>
             <w:r>
-              <w:t>9.02</w:t>
+              <w:t>8.98</w:t>
             </w:r>
           </w:p>
         </w:tc>
@@ -1264,7 +1264,7 @@
           </w:tcPr>
           <w:p>
             <w:r>
-              <w:t>2.00 USD</w:t>
+              <w:t>1.99 USD</w:t>
             </w:r>
           </w:p>
         </w:tc>
@@ -1296,7 +1296,7 @@
           </w:tcPr>
           <w:p>
             <w:r>
-              <w:t>1.06%</w:t>
+              <w:t>1.05%</w:t>
             </w:r>
           </w:p>
         </w:tc>
@@ -1360,7 +1360,7 @@
           </w:tcPr>
           <w:p>
             <w:r>
-              <w:t>70.46%</w:t>
+              <w:t>69.60%</w:t>
             </w:r>
           </w:p>
         </w:tc>
@@ -1392,7 +1392,7 @@
           </w:tcPr>
           <w:p>
             <w:r>
-              <w:t>0.23 USD</w:t>
+              <w:t>-0.02 USD</w:t>
             </w:r>
           </w:p>
         </w:tc>
@@ -1419,7 +1419,7 @@
     </w:p>
     <w:p>
       <w:r>
-        <w:t>Modelul LSTM cu 31,265 parametri obtine un RMSE de $3.00 si un MAE de $2.00 pe setul de test (932 zile). MAPE-ul de 1.06% indica faptul ca, in medie, predictia se abate extrem de putin (aproximativ 1-2%) de la valoarea reala a actiunii.</w:t>
+        <w:t>Modelul LSTM cu 31,265 parametri obtine un RMSE de $3.00 si un MAE de $1.99 pe setul de test (932 zile). MAPE-ul de 1.05% indica faptul ca, in medie, predictia se abate extrem de putin (aproximativ 1-2%) de la valoarea reala a actiunii.</w:t>
       </w:r>
     </w:p>
     <w:p>
@@ -1429,7 +1429,7 @@
     </w:p>
     <w:p>
       <w:r>
-        <w:t>Acuratetea directionala de 70.46% este mult superioara nivelului aleatoriu (50%), confirmand ca semnalul generat de retea ofera indicatii valoroase cu privire la directia miscarii zilnice a pretului.</w:t>
+        <w:t>Acuratetea directionala de 69.60% este mult superioara nivelului aleatoriu (50%), confirmand ca semnalul generat de retea ofera indicatii valoroase cu privire la directia miscarii zilnice a pretului.</w:t>
       </w:r>
     </w:p>
     <w:p>

</xml_diff>

<commit_message>
Change saving of charts to include hyperparameters for later reusing best options
</commit_message>
<xml_diff>
--- a/Raport_Deep_Learning_NYSE_JPM.docx
+++ b/Raport_Deep_Learning_NYSE_JPM.docx
@@ -1200,7 +1200,7 @@
           </w:tcPr>
           <w:p>
             <w:r>
-              <w:t>9.08</w:t>
+              <w:t>8.99</w:t>
             </w:r>
           </w:p>
         </w:tc>
@@ -1232,7 +1232,7 @@
           </w:tcPr>
           <w:p>
             <w:r>
-              <w:t>3.01 USD</w:t>
+              <w:t>3.00 USD</w:t>
             </w:r>
           </w:p>
         </w:tc>
@@ -1296,7 +1296,7 @@
           </w:tcPr>
           <w:p>
             <w:r>
-              <w:t>1.06%</w:t>
+              <w:t>1.05%</w:t>
             </w:r>
           </w:p>
         </w:tc>
@@ -1360,7 +1360,7 @@
           </w:tcPr>
           <w:p>
             <w:r>
-              <w:t>70.46%</w:t>
+              <w:t>69.92%</w:t>
             </w:r>
           </w:p>
         </w:tc>
@@ -1392,7 +1392,7 @@
           </w:tcPr>
           <w:p>
             <w:r>
-              <w:t>-0.02 USD</w:t>
+              <w:t>0.15 USD</w:t>
             </w:r>
           </w:p>
         </w:tc>
@@ -1419,7 +1419,7 @@
     </w:p>
     <w:p>
       <w:r>
-        <w:t>Modelul LSTM cu 31,265 parametri obtine un RMSE de $3.01 si un MAE de $1.99 pe setul de test (932 zile). MAPE-ul de 1.06% indica faptul ca, in medie, predictia se abate extrem de putin (aproximativ 1-2%) de la valoarea reala a actiunii.</w:t>
+        <w:t>Modelul LSTM cu 31,265 parametri obtine un RMSE de $3.00 si un MAE de $1.99 pe setul de test (932 zile). MAPE-ul de 1.05% indica faptul ca, in medie, predictia se abate extrem de putin (aproximativ 1-2%) de la valoarea reala a actiunii.</w:t>
       </w:r>
     </w:p>
     <w:p>
@@ -1429,7 +1429,7 @@
     </w:p>
     <w:p>
       <w:r>
-        <w:t>Acuratetea directionala de 70.46% este mult superioara nivelului aleatoriu (50%), confirmand ca semnalul generat de retea ofera indicatii valoroase cu privire la directia miscarii zilnice a pretului.</w:t>
+        <w:t>Acuratetea directionala de 69.92% este mult superioara nivelului aleatoriu (50%), confirmand ca semnalul generat de retea ofera indicatii valoroase cu privire la directia miscarii zilnice a pretului.</w:t>
       </w:r>
     </w:p>
     <w:p>

</xml_diff>

<commit_message>
refactor: update model architecture, add cross-platform device support, and update project documentation
</commit_message>
<xml_diff>
--- a/Raport_Deep_Learning_NYSE_JPM.docx
+++ b/Raport_Deep_Learning_NYSE_JPM.docx
@@ -52,7 +52,7 @@
         <w:br/>
       </w:r>
       <w:r>
-        <w:t>Perioada: 2001-2025 (942 zile de test)</w:t>
+        <w:t>Perioada: 2001-2025 (932 zile de test)</w:t>
       </w:r>
     </w:p>
     <w:p>
@@ -109,7 +109,7 @@
     </w:p>
     <w:p>
       <w:r>
-        <w:t>A fost selectat ticker-ul JPM (JPMorgan Chase &amp; Co.), una dintre cele mai mari institutii financiare din lume, cu o capitalizare de piata de peste 500 miliarde USD. In urma extragerii datelor, s-au obtinut 6,470 de zile de tranzactionare, cu preturi Close cuprinse intre $101.96 si $329.17.</w:t>
+        <w:t>A fost selectat ticker-ul JPM (JPMorgan Chase &amp; Co.), una dintre cele mai mari institutii financiare din lume, cu o capitalizare de piata de peste 500 miliarde USD. In urma extragerii datelor, s-au obtinut 6,470 de zile de tranzactionare, cu preturi Close cuprinse intre $102.92 si $327.58.</w:t>
       </w:r>
     </w:p>
     <w:p>
@@ -1156,7 +1156,7 @@
           </w:tcPr>
           <w:p>
             <w:r>
-              <w:t>4,542.84</w:t>
+              <w:t>9.08</w:t>
             </w:r>
           </w:p>
         </w:tc>
@@ -1188,7 +1188,7 @@
           </w:tcPr>
           <w:p>
             <w:r>
-              <w:t>67.40 USD</w:t>
+              <w:t>3.01 USD</w:t>
             </w:r>
           </w:p>
         </w:tc>
@@ -1198,7 +1198,7 @@
           </w:tcPr>
           <w:p>
             <w:r>
-              <w:t>Eroarea medie in aceleasi unitati ca pretul (~35.1% din pretul mediu).</w:t>
+              <w:t>Eroarea medie in aceleasi unitati ca pretul (~1.6% din pretul mediu).</w:t>
             </w:r>
           </w:p>
         </w:tc>
@@ -1220,7 +1220,7 @@
           </w:tcPr>
           <w:p>
             <w:r>
-              <w:t>47.60 USD</w:t>
+              <w:t>2.01 USD</w:t>
             </w:r>
           </w:p>
         </w:tc>
@@ -1252,7 +1252,7 @@
           </w:tcPr>
           <w:p>
             <w:r>
-              <w:t>19.56%</w:t>
+              <w:t>1.06%</w:t>
             </w:r>
           </w:p>
         </w:tc>
@@ -1284,7 +1284,7 @@
           </w:tcPr>
           <w:p>
             <w:r>
-              <w:t>-0.1149</w:t>
+              <w:t>0.9978</w:t>
             </w:r>
           </w:p>
         </w:tc>
@@ -1316,7 +1316,7 @@
           </w:tcPr>
           <w:p>
             <w:r>
-              <w:t>52.71%</w:t>
+              <w:t>70.25%</w:t>
             </w:r>
           </w:p>
         </w:tc>
@@ -1348,7 +1348,7 @@
           </w:tcPr>
           <w:p>
             <w:r>
-              <w:t>47.09 USD</w:t>
+              <w:t>0.31 USD</w:t>
             </w:r>
           </w:p>
         </w:tc>
@@ -1375,17 +1375,17 @@
     </w:p>
     <w:p>
       <w:r>
-        <w:t>Modelul LSTM cu 5,537 parametri obtine un RMSE de $67.40 si un MAE de $47.60 pe setul de test (947 zile). MAPE-ul de 19.56% indica faptul ca, in medie, predictia se abate cu aproximativ un sfert de la valoarea reala.</w:t>
+        <w:t>Modelul LSTM cu 5,537 parametri obtine un RMSE de $3.01 si un MAE de $2.01 pe setul de test (947 zile). MAPE-ul de 1.06% indica faptul ca, in medie, predictia se abate cu aproximativ un sfert de la valoarea reala.</w:t>
       </w:r>
     </w:p>
     <w:p>
       <w:r>
-        <w:t>Coeficientul de determinare R² este -0.1149, ceea ce inseamna ca modelul nu reuseste sa explice variatia preturilor mai bine decat media istorica. Acest rezultat este frecvent intalnit in predictia financiara din cauza naturii aproape aleatorii (random walk) a pietelor eficiente.</w:t>
+        <w:t>Coeficientul de determinare R² este 0.9978, ceea ce inseamna ca modelul nu reuseste sa explice variatia preturilor mai bine decat media istorica. Acest rezultat este frecvent intalnit in predictia financiara din cauza naturii aproape aleatorii (random walk) a pietelor eficiente.</w:t>
       </w:r>
     </w:p>
     <w:p>
       <w:r>
-        <w:t>Acuratetea directionala de 52.71% este apropiata de 50% (nivelul aleatoriu), ceea ce confirma dificultatea intrinseca a predictiei directiei preturilor pe piete financiare lichide.</w:t>
+        <w:t>Acuratetea directionala de 70.25% este apropiata de 50% (nivelul aleatoriu), ceea ce confirma dificultatea intrinseca a predictiei directiei preturilor pe piete financiare lichide.</w:t>
       </w:r>
     </w:p>
     <w:p>
@@ -1423,7 +1423,7 @@
         <w:t xml:space="preserve">Bias sistematic: </w:t>
       </w:r>
       <w:r>
-        <w:t>Media erorilor de $47.09 indica o subestimare constanta a preturilor reale, probabil cauzata de trendul ascendent pe termen lung al actiunii JPM.</w:t>
+        <w:t>Media erorilor de $0.31 indica o subestimare constanta a preturilor reale, probabil cauzata de trendul ascendent pe termen lung al actiunii JPM.</w:t>
       </w:r>
     </w:p>
     <w:p>

</xml_diff>